<commit_message>
1.10.2: kode nomor dokumen FDS diganti FI
Co-Authored-By: Claude Opus 5.5 <noreply@anthropic.com>
Claude-Session: https://claude.ai/code/session_01H4ZVrZ9V3BgNkxuhZCNDSa
</commit_message>
<xml_diff>
--- a/dokumen/office/FUSIONIFY-Perjanjian.docx
+++ b/dokumen/office/FUSIONIFY-Perjanjian.docx
@@ -48,7 +48,7 @@
         <w:t xml:space="preserve">001</w:t>
       </w:r>
       <w:r>
-        <w:t xml:space="preserve">/PRJ/FDS/</w:t>
+        <w:t xml:space="preserve">/PRJ/FI/</w:t>
       </w:r>
       <w:r>
         <w:rPr>
@@ -1864,7 +1864,7 @@
         <w:sz w:val="14"/>
         <w:szCs w:val="14"/>
       </w:rPr>
-      <w:t xml:space="preserve">Perjanjian 001/PRJ/FDS  ·  Paraf: ______ / ______</w:t>
+      <w:t xml:space="preserve">Perjanjian 001/PRJ/FI  ·  Paraf: ______ / ______</w:t>
     </w:r>
     <w:r>
       <w:t xml:space="preserve">	</w:t>

</xml_diff>